<commit_message>
Fix Playbook + Briefing tactic references to real book tactics
Before: tactic references like "Low-Status Opening (book p.41)" which were
actually Vault technique names (not book tactics) plus fabricated page numbers.
If a buyer flipped to p.41 of the book, they'd find unrelated content.

After: references are to the real 47 book tactics using their real names and
numbers, with Part references (I-IV) instead of page numbers.

Example: "Tactic #5: The Consultant Stance (Part I)" in place of
"Low-Status Opening (p.41)".

All 60 tactic references in 20 playbooks remapped. All 12 conversation types
in the briefing's 3-Tactic Selector remapped. Also replaced "Parent / teenager
communication" with a broader "Hard conversation with a teenager or adult
child" to match the broader audience the funnel now targets.

Verified: zero p.XX references remain in either file.

Co-Authored-By: Claude Opus 4.7 (1M context) <noreply@anthropic.com>
</commit_message>
<xml_diff>
--- a/funnel/exports/bump-pre-conversation-briefing.docx
+++ b/funnel/exports/bump-pre-conversation-briefing.docx
@@ -1435,7 +1435,7 @@
           <w:color w:val="1A1A1A"/>
           <w:sz w:val="21"/>
         </w:rPr>
-        <w:t>Low-Status Opening (book p.41), Strategic Pause (p.78), The One-Line Email Lock-In (p.129)</w:t>
+        <w:t>#5 The Consultant Stance, #11 The Strategic Pause, #41 The One-Line Email</w:t>
       </w:r>
     </w:p>
     <w:p>
@@ -1458,7 +1458,7 @@
           <w:color w:val="1A1A1A"/>
           <w:sz w:val="21"/>
         </w:rPr>
-        <w:t>Cold Open (p.34), The Specific Memory Citation (p.92), Validating Without Agreeing (p.101)</w:t>
+        <w:t>#1 The Cold Open, #18 The Named Feeling, #17 The Earlier Agreement</w:t>
       </w:r>
     </w:p>
     <w:p>
@@ -1481,7 +1481,7 @@
           <w:color w:val="1A1A1A"/>
           <w:sz w:val="21"/>
         </w:rPr>
-        <w:t>Unrelated Reference Open (p.37), Micro-Disclosure (p.48), Permission Frame (p.56)</w:t>
+        <w:t>#1 The Cold Open, #6 The Confession First, #8 The Unrepayable Favor</w:t>
       </w:r>
     </w:p>
     <w:p>
@@ -1504,7 +1504,7 @@
           <w:color w:val="1A1A1A"/>
           <w:sz w:val="21"/>
         </w:rPr>
-        <w:t>Accusation Audit (p.46), Boundary Without Anger (p.118), Document the Concern (p.125)</w:t>
+        <w:t>#4 The Assumption Audit, #19 The Pre-Understood Objection, #11 The Strategic Pause</w:t>
       </w:r>
     </w:p>
     <w:p>
@@ -1527,7 +1527,7 @@
           <w:color w:val="1A1A1A"/>
           <w:sz w:val="21"/>
         </w:rPr>
-        <w:t>The Accusation Audit (p.46), Labeling What They Feel (p.88), Thank-Then-Clarify (p.127)</w:t>
+        <w:t>#4 The Assumption Audit, #18 The Named Feeling, #44 The Post-Agreement Bridge</w:t>
       </w:r>
     </w:p>
     <w:p>
@@ -1550,7 +1550,7 @@
           <w:color w:val="1A1A1A"/>
           <w:sz w:val="21"/>
         </w:rPr>
-        <w:t>The 11-Second Silence (p.79), “What would make you comfortable?” (p.124), Stake-In-Ground close (p.132)</w:t>
+        <w:t>#11 The Strategic Pause, #13 The Impossible Answer, #41 The One-Line Email</w:t>
       </w:r>
     </w:p>
     <w:p>
@@ -1565,7 +1565,7 @@
           <w:color w:val="1A1A1A"/>
           <w:sz w:val="21"/>
         </w:rPr>
-        <w:t xml:space="preserve">Parent / teenager communication  →  </w:t>
+        <w:t xml:space="preserve">Hard conversation with a teenager or adult child  →  </w:t>
       </w:r>
       <w:r>
         <w:rPr>
@@ -1573,7 +1573,7 @@
           <w:color w:val="1A1A1A"/>
           <w:sz w:val="21"/>
         </w:rPr>
-        <w:t>Permission Frame (p.56), Planting the Conclusion (p.66), The Observer Frame (p.108)</w:t>
+        <w:t>#2 The Pre-Frame, #21 The Discovery Path, #37 The Unclosing</w:t>
       </w:r>
     </w:p>
     <w:p>
@@ -1596,7 +1596,7 @@
           <w:color w:val="1A1A1A"/>
           <w:sz w:val="21"/>
         </w:rPr>
-        <w:t>Reverse Qualifier Opener (p.52), Socratic Cascade (p.63), Calendar Pull close (p.131)</w:t>
+        <w:t>#33 The Reverse Qualifier, #21 The Discovery Path, #25 The Stakes Shift</w:t>
       </w:r>
     </w:p>
     <w:p>
@@ -1619,7 +1619,7 @@
           <w:color w:val="1A1A1A"/>
           <w:sz w:val="21"/>
         </w:rPr>
-        <w:t>DARVO Detection (p.114), Grey Rock Response (p.117), The Witness Frame (p.121)</w:t>
+        <w:t>#4 The Assumption Audit, #35 The Volcano, #40 The Public Witness</w:t>
       </w:r>
     </w:p>
     <w:p>
@@ -1642,7 +1642,7 @@
           <w:color w:val="1A1A1A"/>
           <w:sz w:val="21"/>
         </w:rPr>
-        <w:t>Micro-Disclosure (p.48), Parallel Vulnerability (p.87), The 24-Hour Lock email (p.137)</w:t>
+        <w:t>#6 The Confession First, #18 The Named Feeling, #41 The One-Line Email</w:t>
       </w:r>
     </w:p>
     <w:p>
@@ -1665,7 +1665,7 @@
           <w:color w:val="1A1A1A"/>
           <w:sz w:val="21"/>
         </w:rPr>
-        <w:t>Low-Status Opening (p.41), The Question That Flatters (p.94), Research Credibility Drop (p.50)</w:t>
+        <w:t>#5 The Consultant Stance, #22 The Misdirected Question, #33 The Reverse Qualifier</w:t>
       </w:r>
     </w:p>
     <w:p>
@@ -1688,7 +1688,7 @@
           <w:color w:val="1A1A1A"/>
           <w:sz w:val="21"/>
         </w:rPr>
-        <w:t>Pre-Frame Drop (p.38), The Pause Before the Ask (p.55), Commitment Without Ask (p.133)</w:t>
+        <w:t>#2 The Pre-Frame, #11 The Strategic Pause, #43 The Minimum Viable Commitment</w:t>
       </w:r>
     </w:p>
     <w:p>

</xml_diff>